<commit_message>
Reframe UC1 as an out-of-fold back-test and add end-to-end recording guide
The brief is now dated 1 Oct 2026 (after the Jul-Sep outcome window) and the
target list is a back-test scored with out-of-fold predictions, so no
customer is scored by a model that trained on them. Task notes, metadata,
use-case doc and Use_Cases_v2.xlsx updated to match. New
UC1_Recording_Guide_Windows_Teams.md covers setup, rehearsal, Teams
recording, the minute-by-minute take with reference numbers, and review.

Co-Authored-By: Claude Opus 5.5 <noreply@anthropic.com>
</commit_message>
<xml_diff>
--- a/recording_workspace/UC1_Cross_Sell/Deliverables/input 3 - campaign brief.docx
+++ b/recording_workspace/UC1_Cross_Sell/Deliverables/input 3 - campaign brief.docx
@@ -7,7 +7,7 @@
         <w:pStyle w:val="Heading1"/>
       </w:pPr>
       <w:r>
-        <w:t>Q3 Cross-Sell Campaign - Targeting Brief</w:t>
+        <w:t>Cross-Sell Targeting Model - Brief for Q4 Campaign</w:t>
       </w:r>
     </w:p>
     <w:p>
@@ -40,7 +40,7 @@
         <w:t xml:space="preserve">Date: </w:t>
       </w:r>
       <w:r>
-        <w:t>1 July 2026</w:t>
+        <w:t>1 October 2026</w:t>
       </w:r>
     </w:p>
     <w:p>
@@ -51,7 +51,7 @@
         <w:t xml:space="preserve">Decision needed by: </w:t>
       </w:r>
       <w:r>
-        <w:t>15 July 2026 campaign planning meeting</w:t>
+        <w:t>15 October 2026 Q4 campaign planning meeting</w:t>
       </w:r>
     </w:p>
     <w:p>
@@ -64,12 +64,17 @@
     </w:p>
     <w:p>
       <w:r>
-        <w:t>Our Q3 campaign will offer an additional product (credit card, savings, personal loan or insurance) to existing customers. Last year we contacted customers at random and converted roughly 1 in 9. We want to stop spending budget on customers who are very unlikely to buy.</w:t>
+        <w:t>Our campaigns offer an additional product (credit card, savings, personal loan or insurance) to existing customers. So far we have contacted customers at random and converted roughly 1 in 9. We want to stop spending budget on customers who are very unlikely to buy.</w:t>
       </w:r>
     </w:p>
     <w:p>
       <w:r>
-        <w:t>The Data Warehouse team has shared a snapshot of 20,000 customers as of 30 June 2026, together with whether each customer opened an additional product in the following 90 days (file: input 1 - customers.csv, definitions in input 2 - data dictionary.xlsx).</w:t>
+        <w:t>The Data Warehouse team has shared a snapshot of 20,000 customers as of 30 June 2026, together with whether each customer opened an additional product in the following 90 days (July - September). File: input 1 - customers.csv, definitions in input 2 - data dictionary.xlsx.</w:t>
+      </w:r>
+    </w:p>
+    <w:p>
+      <w:r>
+        <w:t>Before we commit the Q4 budget we want evidence: if we had used a model on 30 June, how many more customers would we have converted than with random selection?</w:t>
       </w:r>
     </w:p>
     <w:p>
@@ -82,12 +87,12 @@
     </w:p>
     <w:p>
       <w:r>
-        <w:t>1. A model that ranks customers by their likelihood to buy another product in the next 90 days.</w:t>
+        <w:t>1. A model that ranks customers by their likelihood to buy another product in the next 90 days, packaged so we can score the 30 September snapshot for Q4.</w:t>
       </w:r>
     </w:p>
     <w:p>
       <w:r>
-        <w:t>2. A target list of exactly 4,000 customers for the Q3 campaign, with expected conversions.</w:t>
+        <w:t>2. A back-test target list: the 4,000 customers the model would have selected on 30 June, scored only with models that did not train on those customers, with expected and actual conversions and ROI compared to random selection.</w:t>
       </w:r>
     </w:p>
     <w:p>
@@ -113,7 +118,7 @@
         <w:pStyle w:val="ListBullet"/>
       </w:pPr>
       <w:r>
-        <w:t>Budget: 4,000 contacts in total. Cost per contact (incl. incentive): $4.</w:t>
+        <w:t>Budget: 4,000 contacts per campaign. Cost per contact (incl. incentive): $4.</w:t>
       </w:r>
     </w:p>
     <w:p>
@@ -201,7 +206,7 @@
         <w:pStyle w:val="ListBullet"/>
       </w:pPr>
       <w:r>
-        <w:t>Target list honours every compliance and customer-care rule above and has exactly 4,000 rows.</w:t>
+        <w:t>Back-test list honours every compliance and customer-care rule above, has exactly 4,000 rows, and its actual conversion rate is at least 2x the eligible-customer average.</w:t>
       </w:r>
     </w:p>
     <w:p>

</xml_diff>